<commit_message>
Fix watchdog_ip M8/M9: exercise CONFIGURE_TIMEOUT for real in its two scenarios
The fourth isolated model review found test_scenarios[0]/[1] both declare
CONFIGURE_TIMEOUT as the first step of their input_sequence, but the tests
written for them set the timeout via a default_timeout_cycles constructor
kwarg instead of actually issuing the command -- so config_intake's own
FSM was never exercised by either test despite the template claiming it was.
Both now call model.configure_timeout(...) for real before arming.

Fourth and (pending one more clean pass) hopefully final real finding this
dogfood round: M1-M5, M6, M7, now M8-M9, each caught by a fresh isolated
review after fixing the round before it.

Co-Authored-By: Claude Sonnet 5 <noreply@anthropic.com>
Claude-Session: https://claude.ai/code/session_01H7swSwvtxQVv4RNQcLqc6R
</commit_message>
<xml_diff>
--- a/docs/project_overview.docx
+++ b/docs/project_overview.docx
@@ -3841,7 +3841,7 @@
           </w:tcPr>
           <w:p>
             <w:r>
-              <w:t>stale — watchdog_ip.template.yaml changed since this review; a fresh round is owed</w:t>
+              <w:t>stale — test_watchdog_ip.py changed since this review; a fresh round is owed</w:t>
             </w:r>
           </w:p>
         </w:tc>
@@ -3851,7 +3851,7 @@
           </w:tcPr>
           <w:p>
             <w:r>
-              <w:t>M7 (superseded)</w:t>
+              <w:t>M8, M9 (superseded)</w:t>
             </w:r>
           </w:p>
         </w:tc>

</xml_diff>

<commit_message>
watchdog_ip: clean model review (0 findings) after 5 rounds of real fixes
The sixth isolated review dispatch against the current template/model/tests
found nothing: every FSM transition, latency, wait-point/ack semantics
(including the ARMED/EXPIRED dual wait-point from M7), and all three
test_scenarios check out against the template. recheck_review_findings and
stamp_provenance both pass.

Closes the review loop for this dogfood exercise: five real findings
(M1-M5 timing/scenario gaps, M6 DLD self-contradiction, M7 wait-model gap,
M8-M9 unexercised command path, M10 unverified scenario property) found and
fixed across five isolated, no-memory review rounds, each catching something
the previous clean-passing round could not see.

Co-Authored-By: Claude Sonnet 5 <noreply@anthropic.com>
Claude-Session: https://claude.ai/code/session_01H7swSwvtxQVv4RNQcLqc6R
</commit_message>
<xml_diff>
--- a/docs/project_overview.docx
+++ b/docs/project_overview.docx
@@ -3841,7 +3841,7 @@
           </w:tcPr>
           <w:p>
             <w:r>
-              <w:t>stale — test_watchdog_ip.py changed since this review; a fresh round is owed</w:t>
+              <w:t>current</w:t>
             </w:r>
           </w:p>
         </w:tc>
@@ -3851,7 +3851,7 @@
           </w:tcPr>
           <w:p>
             <w:r>
-              <w:t>M10 (superseded)</w:t>
+              <w:t>none</w:t>
             </w:r>
           </w:p>
         </w:tc>

</xml_diff>

<commit_message>
Fix stale 2-3-IP prose in project_overview.md now that there are 4
The narrative "Modeled IPs (3)" table and "What the gates currently cover"
section still described the repo as it was before storage_pipeline_subsystem
and watchdog_ip existed: "neither IP"/"both IPs"/"either one" phrasing
assumed exactly 2, the subsystem wiring stage was said to check zero
subsystems (it now checks storage_pipeline_subsystem for real), and the
review-history paragraph only named arbitration_ip/completion_ip.

Also fixes the same bug at its root: tools/report_review_status.py hardcoded
the literal string "either live IP" in its generated review-status block
regardless of how many IPs actually lack a normalization review -- now
computed from the real count so it can't go stale again as more IPs are
added.

Co-Authored-By: Claude Sonnet 5 <noreply@anthropic.com>
Claude-Session: https://claude.ai/code/session_01H7swSwvtxQVv4RNQcLqc6R
</commit_message>
<xml_diff>
--- a/docs/project_overview.docx
+++ b/docs/project_overview.docx
@@ -3859,7 +3859,7 @@
     </w:tbl>
     <w:p>
       <w:r>
-        <w:t>No normalization review has been run against either live IP yet.</w:t>
+        <w:t>No normalization review has been run against any of the 4 live IPs yet.</w:t>
       </w:r>
     </w:p>
     <w:p>
@@ -3893,7 +3893,7 @@
         <w:pStyle w:val="Heading2"/>
       </w:pPr>
       <w:r>
-        <w:t>Modeled IPs (3)</w:t>
+        <w:t>Modeled IPs (4)</w:t>
       </w:r>
     </w:p>
     <w:tbl>
@@ -3994,6 +3994,28 @@
           </w:p>
         </w:tc>
       </w:tr>
+      <w:tr>
+        <w:tc>
+          <w:tcPr>
+            <w:tcW w:type="dxa" w:w="4680"/>
+          </w:tcPr>
+          <w:p>
+            <w:r>
+              <w:t>watchdog_ip</w:t>
+            </w:r>
+          </w:p>
+        </w:tc>
+        <w:tc>
+          <w:tcPr>
+            <w:tcW w:type="dxa" w:w="4680"/>
+          </w:tcPr>
+          <w:p>
+            <w:r>
+              <w:t>Host-liveness countdown timer: arm/kick/disarm, latched expiry until disarmed, and a timeout configurable independent of any countdown already running.</w:t>
+            </w:r>
+          </w:p>
+        </w:tc>
+      </w:tr>
     </w:tbl>
     <w:p>
       <w:pPr>
@@ -4005,12 +4027,12 @@
     </w:p>
     <w:p>
       <w:r>
-        <w:t>Worth reading before a green run is taken for more than it says. dld_normalization still checks zero documents, because neither IP carries an author source (dlds/&lt;ip&gt;_dld.src.md) — both DLDs were written in-shape from the start, so normalize_dld and review_normalization have never run for real against either one. The subsystem wiring stage inside validate_dld_flow.py also checks zero subsystems.</w:t>
-      </w:r>
-    </w:p>
-    <w:p>
-      <w:r>
-        <w:t>review_model is a different story: both IPs have real review history now. reviews/arbitration_ip.model.findings.yaml carries round ten's pass and reviews/completion_ip.model.findings.yaml carries round eleven's — arbitration_ip has been through six independent rounds since round five (five through ten), completion_ip three (five, six, eleven), each run as an isolated agent with no memory of the session that had just fixed the round before it, and no access to decisions/*.md or any prior round's findings. Every finding any of these rounds filed is fixed or dismissed by name in decisions/&lt;ip&gt;.md. That is not the same claim as "these models are faithful": an empty findings list, or a fully-resolved one, records that a reviewer looked and reported nothing further, which is a weaker claim than "faithful" and must never be read as the stronger one. It is, at least, the opposite of the earlier state this section used to describe — before round five, decisions/ and reviews/ held only their READMEs, and nobody had looked at all.</w:t>
+        <w:t>Worth reading before a green run is taken for more than it says. dld_normalization still checks zero documents, because none of the four IPs carries an author source (dlds/&lt;ip&gt;_dld.src.md) — every DLD was written in-shape from the start, so normalize_dld and review_normalization have never run for real against any of them. The subsystem wiring stage inside validate_dld_flow.py, by contrast, does check a real subsystem now: storage_pipeline_subsystem composes arbitration_ip and completion_ip, and its wiring passes for real, not against a synthetic fixture.</w:t>
+      </w:r>
+    </w:p>
+    <w:p>
+      <w:r>
+        <w:t>review_model is a different story: all four IPs have real review history now. reviews/arbitration_ip.model.findings.yaml carries round ten's pass and reviews/completion_ip.model.findings.yaml carries round eleven's — arbitration_ip has been through six independent rounds since round five (five through ten), completion_ip three (five, six, eleven), each run as an isolated agent with no memory of the session that had just fixed the round before it, and no access to decisions/*.md or any prior round's findings. storage_pipeline_subsystem and watchdog_ip each carry their own real review history the same way — watchdog_ip's in particular went through six dispatches end to end while it was being written, five straight rounds each finding something real before the sixth came back clean, the same isolation and no-memory-of-the-round-before contract throughout. Every finding any of these rounds filed is fixed or dismissed by name in decisions/&lt;ip&gt;.md. That is not the same claim as "these models are faithful": an empty findings list, or a fully-resolved one, records that a reviewer looked and reported nothing further, which is a weaker claim than "faithful" and must never be read as the stronger one. It is, at least, the opposite of the earlier state this section used to describe — before round five, decisions/ and reviews/ held only their READMEs, and nobody had looked at all.</w:t>
       </w:r>
     </w:p>
     <w:p>

</xml_diff>

<commit_message>
Dismiss M40: another repeat of completion_ip's qos_config_if gap
The review re-dispatched to confirm M38's fix re-found the same
qos_config_if wait_for_ack_inline gap already dismissed three times
as M33/M36/M37: configure_tenant/set_tenant_alive/credit_tokens all
apply synchronously instead of gating on refill.REFILL_BASE. Same
reasoning, same conclusion -- closing it for real needs
qos_config_if to have its own always-running acknowledger, which
nothing about this round changes.

Regenerated the review-status autogen block and docx to match.
</commit_message>
<xml_diff>
--- a/docs/project_overview.docx
+++ b/docs/project_overview.docx
@@ -3799,7 +3799,7 @@
           </w:tcPr>
           <w:p>
             <w:r>
-              <w:t>stale — completion_ip.py changed since this review; a fresh round is owed</w:t>
+              <w:t>current</w:t>
             </w:r>
           </w:p>
         </w:tc>
@@ -3809,7 +3809,7 @@
           </w:tcPr>
           <w:p>
             <w:r>
-              <w:t>M38, M39 (superseded)</w:t>
+              <w:t>M40 (dismissed)</w:t>
             </w:r>
           </w:p>
         </w:tc>
@@ -3922,7 +3922,7 @@
         <w:pStyle w:val="ListBullet"/>
       </w:pPr>
       <w:r>
-        <w:t>completion_ip: M15, M33, M36, M37, M39</w:t>
+        <w:t>completion_ip: M15, M33, M36, M37, M39, M40</w:t>
       </w:r>
     </w:p>
     <w:p>

</xml_diff>

<commit_message>
Add hosted CI via GitHub Actions running the existing gate suite
PR #55 sat for ~20 hours with zero automated signal because this repo's
CI was local-only (pre-push hook, easily skipped or never enabled). Add
.github/workflows/ci.yml running the same `python tools/run_ci.py` on a
clean checkout for every push/PR against develop and main, so a failing
gate shows as a PR status check instead of depending on the hook. Update
README.md and docs/project_overview.md's CI sections, which claimed "no
hosted runner by choice", to describe both layers; regenerated and
re-stamped project_overview.docx to match.

Co-Authored-By: Claude Sonnet 5 <noreply@anthropic.com>
Claude-Session: https://claude.ai/code/session_01H7swSwvtxQVv4RNQcLqc6R
</commit_message>
<xml_diff>
--- a/docs/project_overview.docx
+++ b/docs/project_overview.docx
@@ -1733,7 +1733,7 @@
     </w:p>
     <w:p>
       <w:r>
-        <w:t>This is the repo's CI, and it is local by choice — there is no hosted runner. The gate list is read from the harness, so adding a scope: repo stage adds it to CI with no code change. Running locally gives up two things a hosted runner provides, so the tool replaces both: it checks that the declared dependencies are actually installed (locally a gate can quietly depend on a package one machine happens to have), and it warns when the working tree is dirty, because then the files being checked are not the commits being pushed.</w:t>
+        <w:t>This is the repo's CI. .github/workflows/ci.yml runs the identical command on GitHub Actions, against a clean checkout, on every push and pull request — that hosted run is the actual enforcement backstop, showing as a PR status check so a failing gate is visible to a reviewer without anyone running anything locally. The gate list is read from the harness, so adding a scope: repo stage adds it to both the local command and the hosted workflow with no code change. The local hook exists so the same gates can be caught before a push instead of only after one, and it closes two gaps a hosted-only setup would still have for the pre-push case: it checks that the declared dependencies are actually installed (locally a gate can quietly depend on a package one machine happens to have), and it warns when the working tree is dirty, because then the files being checked are not the commits being pushed.</w:t>
       </w:r>
     </w:p>
     <w:p>
@@ -4180,12 +4180,12 @@
         <w:pStyle w:val="ListBullet"/>
       </w:pPr>
       <w:r>
-        <w:t>Every gate runs in one command, locally. python tools/run_ci.py runs the</w:t>
-      </w:r>
-    </w:p>
-    <w:p>
-      <w:r>
-        <w:t>repo-wide gates — read from the harness, so adding a stage adds it to CI — and .githooks/pre-push runs them before a push. There is no hosted CI by choice, so the runner replaces what a hosted one gives free: it checks that the declared dependencies are actually installed, and says so when the working tree is dirty and the files checked are not the commits being pushed.</w:t>
+        <w:t>Every gate runs in one command, and hosted on every PR. `python</w:t>
+      </w:r>
+    </w:p>
+    <w:p>
+      <w:r>
+        <w:t>tools/run_ci.py runs the repo-wide gates — read from the harness, so adding a stage adds it to CI — and .github/workflows/ci.yml runs the same command on GitHub Actions on every push and pull request, so a failing gate shows as a PR status check rather than depending on anyone remembering to run anything. .githooks/pre-push` runs the same gates locally before a push, closing the two gaps a hosted-only setup would still leave for that earlier moment: it checks that the declared dependencies are actually installed, and says so when the working tree is dirty and the files checked are not the commits being pushed.</w:t>
       </w:r>
     </w:p>
     <w:p>

</xml_diff>